<commit_message>
fixed the name on the report
</commit_message>
<xml_diff>
--- a/AAT1_Agile-Devops Report.docx
+++ b/AAT1_Agile-Devops Report.docx
@@ -600,7 +600,7 @@
                 <w:sz w:val="24"/>
                 <w:szCs w:val="24"/>
               </w:rPr>
-              <w:t>BHOOMIKA K NAYAK</w:t>
+              <w:t>DIKSHITH M</w:t>
             </w:r>
           </w:p>
         </w:tc>
@@ -644,7 +644,7 @@
                 <w:sz w:val="24"/>
                 <w:szCs w:val="24"/>
               </w:rPr>
-              <w:t>31</w:t>
+              <w:t>44</w:t>
             </w:r>
           </w:p>
         </w:tc>
@@ -1454,7 +1454,7 @@
           <w:sz w:val="24"/>
           <w:szCs w:val="24"/>
         </w:rPr>
-        <w:t>Bhoomika</w:t>
+        <w:t>Dikshith M</w:t>
       </w:r>
       <w:r>
         <w:rPr>
@@ -1474,7 +1474,7 @@
           <w:sz w:val="24"/>
           <w:szCs w:val="24"/>
         </w:rPr>
-        <w:t>31</w:t>
+        <w:t>44</w:t>
       </w:r>
       <w:r>
         <w:rPr>
@@ -2091,13 +2091,6 @@
           <w:szCs w:val="24"/>
         </w:rPr>
         <w:tab/>
-      </w:r>
-      <w:r>
-        <w:rPr>
-          <w:rFonts w:ascii="Times New Roman" w:eastAsia="Times New Roman" w:hAnsi="Times New Roman" w:cs="Times New Roman"/>
-          <w:sz w:val="24"/>
-          <w:szCs w:val="24"/>
-        </w:rPr>
         <w:t>I declare that I abide by the ethical principles and commit to professional ethics and responsibilities and norms of the engineering practice. The work submitted in this report of INTRODUCTION TO AGILE-DEVOPS INTEGRATION – 22IS673,VI Semester BE, ISE has been compiled by referring to the relevant online and offline resources to the best of my understanding and in partial fulfillment of the requirement for the award of</w:t>
       </w:r>
       <w:r>
@@ -2940,6 +2933,7 @@
         <w:tabs>
           <w:tab w:val="left" w:pos="2892"/>
         </w:tabs>
+        <w:jc w:val="center"/>
         <w:rPr>
           <w:rFonts w:ascii="Times New Roman" w:eastAsia="Times New Roman" w:hAnsi="Times New Roman" w:cs="Times New Roman"/>
           <w:b/>
@@ -3623,7 +3617,7 @@
     <w:p>
       <w:pPr>
         <w:spacing w:line="360" w:lineRule="auto"/>
-        <w:jc w:val="both"/>
+        <w:jc w:val="center"/>
         <w:rPr>
           <w:rFonts w:ascii="Times New Roman" w:eastAsia="Times New Roman" w:hAnsi="Times New Roman" w:cs="Times New Roman"/>
           <w:b/>
@@ -4610,7 +4604,7 @@
     <w:p>
       <w:pPr>
         <w:spacing w:line="360" w:lineRule="auto"/>
-        <w:jc w:val="both"/>
+        <w:jc w:val="center"/>
         <w:rPr>
           <w:rFonts w:ascii="Times New Roman" w:eastAsia="Times New Roman" w:hAnsi="Times New Roman" w:cs="Times New Roman"/>
           <w:b/>
@@ -5692,7 +5686,7 @@
     <w:p>
       <w:pPr>
         <w:spacing w:line="360" w:lineRule="auto"/>
-        <w:jc w:val="both"/>
+        <w:jc w:val="center"/>
         <w:rPr>
           <w:rFonts w:ascii="Times New Roman" w:eastAsia="Times New Roman" w:hAnsi="Times New Roman" w:cs="Times New Roman"/>
           <w:b/>
@@ -6422,12 +6416,20 @@
           <w:szCs w:val="24"/>
           <w:lang w:val="en-IN"/>
         </w:rPr>
-      </w:pPr>
-    </w:p>
-    <w:p>
-      <w:pPr>
-        <w:spacing w:line="360" w:lineRule="auto"/>
-        <w:jc w:val="both"/>
+        <w:sectPr>
+          <w:headerReference w:type="default" r:id="rId17"/>
+          <w:footerReference w:type="default" r:id="rId18"/>
+          <w:pgSz w:w="12240" w:h="15840"/>
+          <w:pgMar w:top="1440" w:right="1440" w:bottom="1440" w:left="1440" w:header="720" w:footer="720" w:gutter="0"/>
+          <w:pgNumType w:start="1"/>
+          <w:cols w:space="720"/>
+        </w:sectPr>
+      </w:pPr>
+    </w:p>
+    <w:p>
+      <w:pPr>
+        <w:spacing w:line="360" w:lineRule="auto"/>
+        <w:jc w:val="center"/>
         <w:rPr>
           <w:rFonts w:ascii="Times New Roman" w:eastAsia="Times New Roman" w:hAnsi="Times New Roman" w:cs="Times New Roman"/>
           <w:b/>
@@ -6444,6 +6446,7 @@
           <w:sz w:val="32"/>
           <w:szCs w:val="32"/>
         </w:rPr>
+        <w:lastRenderedPageBreak/>
         <w:t>CONCLUSION</w:t>
       </w:r>
     </w:p>
@@ -6465,7 +6468,6 @@
           <w:szCs w:val="24"/>
           <w:lang w:val="en-IN"/>
         </w:rPr>
-        <w:lastRenderedPageBreak/>
         <w:t>The AI-driven Civic Triage System addresses the key challenges faced by traditional complaint management systems by introducing automation, intelligence, and efficiency into the process. By integrating advanced technologies such as Natural Language Processing, Computer Vision, and Speech Recognition, the system is capable of handling multimodal inputs and extracting meaningful information from diverse data sources. This enables accurate classification of complaints and ensures that they are routed to the appropriate departments without delays.</w:t>
       </w:r>
     </w:p>
@@ -6547,8 +6549,6 @@
       </w:pPr>
     </w:p>
     <w:sectPr>
-      <w:headerReference w:type="default" r:id="rId17"/>
-      <w:footerReference w:type="default" r:id="rId18"/>
       <w:pgSz w:w="12240" w:h="15840"/>
       <w:pgMar w:top="1440" w:right="1440" w:bottom="1440" w:left="1440" w:header="720" w:footer="720" w:gutter="0"/>
       <w:pgNumType w:start="1"/>
@@ -6694,15 +6694,6 @@
         <w:szCs w:val="20"/>
       </w:rPr>
       <w:tab/>
-    </w:r>
-    <w:r>
-      <w:rPr>
-        <w:rFonts w:ascii="Times New Roman" w:eastAsia="Times New Roman" w:hAnsi="Times New Roman" w:cs="Times New Roman"/>
-        <w:b/>
-        <w:bCs/>
-        <w:sz w:val="20"/>
-        <w:szCs w:val="20"/>
-      </w:rPr>
       <w:t xml:space="preserve">                                                 AY 2025-26                                                                  Page  </w:t>
     </w:r>
     <w:r>

</xml_diff>